<commit_message>
update final report with pdf
</commit_message>
<xml_diff>
--- a/score/files (1)/Legal_RAG_Report.docx
+++ b/score/files (1)/Legal_RAG_Report.docx
@@ -611,8 +611,37 @@
         <w:spacing w:before="40" w:after="40"/>
       </w:pPr>
       <w:r>
-        <w:t>Four FAISS indexes: divorce_cases, divorce_codes, inheritance_cases, inheritance_codes</w:t>
-      </w:r>
+        <w:t xml:space="preserve">Four FAISS indexes: </w:t>
+      </w:r>
+      <w:proofErr w:type="spellStart"/>
+      <w:r>
+        <w:t>divorce_cases</w:t>
+      </w:r>
+      <w:proofErr w:type="spellEnd"/>
+      <w:r>
+        <w:t xml:space="preserve">, </w:t>
+      </w:r>
+      <w:proofErr w:type="spellStart"/>
+      <w:r>
+        <w:t>divorce_codes</w:t>
+      </w:r>
+      <w:proofErr w:type="spellEnd"/>
+      <w:r>
+        <w:t xml:space="preserve">, </w:t>
+      </w:r>
+      <w:proofErr w:type="spellStart"/>
+      <w:r>
+        <w:t>inheritance_cases</w:t>
+      </w:r>
+      <w:proofErr w:type="spellEnd"/>
+      <w:r>
+        <w:t xml:space="preserve">, </w:t>
+      </w:r>
+      <w:proofErr w:type="spellStart"/>
+      <w:r>
+        <w:t>inheritance_codes</w:t>
+      </w:r>
+      <w:proofErr w:type="spellEnd"/>
     </w:p>
     <w:p>
       <w:pPr>
@@ -646,7 +675,15 @@
         <w:t xml:space="preserve">- </w:t>
       </w:r>
       <w:r>
-        <w:t>country (Italy / Estonia / Slovenia), doc_type (case / code)</w:t>
+        <w:t xml:space="preserve">country (Italy / Estonia / Slovenia), </w:t>
+      </w:r>
+      <w:proofErr w:type="spellStart"/>
+      <w:r>
+        <w:t>doc_type</w:t>
+      </w:r>
+      <w:proofErr w:type="spellEnd"/>
+      <w:r>
+        <w:t xml:space="preserve"> (case / code)</w:t>
       </w:r>
     </w:p>
     <w:p>
@@ -711,12 +748,14 @@
       <w:r>
         <w:t xml:space="preserve">Documents are chunked using a </w:t>
       </w:r>
+      <w:proofErr w:type="spellStart"/>
       <w:r>
         <w:rPr>
           <w:u w:val="single"/>
         </w:rPr>
         <w:t>RecursiveCharacterTextSplitter</w:t>
       </w:r>
+      <w:proofErr w:type="spellEnd"/>
       <w:r>
         <w:t xml:space="preserve"> with</w:t>
       </w:r>
@@ -998,7 +1037,23 @@
                 <w:sz w:val="20"/>
                 <w:szCs w:val="20"/>
               </w:rPr>
-              <w:t>512-token chunks, 50-token overlap (RecursiveCharacterTextSplitter)</w:t>
+              <w:t>512-token chunks, 50-token overlap (</w:t>
+            </w:r>
+            <w:proofErr w:type="spellStart"/>
+            <w:r>
+              <w:rPr>
+                <w:sz w:val="20"/>
+                <w:szCs w:val="20"/>
+              </w:rPr>
+              <w:t>RecursiveCharacterTextSplitter</w:t>
+            </w:r>
+            <w:proofErr w:type="spellEnd"/>
+            <w:r>
+              <w:rPr>
+                <w:sz w:val="20"/>
+                <w:szCs w:val="20"/>
+              </w:rPr>
+              <w:t>)</w:t>
             </w:r>
           </w:p>
         </w:tc>
@@ -1132,7 +1187,39 @@
                 <w:sz w:val="20"/>
                 <w:szCs w:val="20"/>
               </w:rPr>
-              <w:t>GPT-4o-mini via OpenRouter; max_tokens=768, temperature=0.2</w:t>
+              <w:t xml:space="preserve">GPT-4o-mini via </w:t>
+            </w:r>
+            <w:proofErr w:type="spellStart"/>
+            <w:r>
+              <w:rPr>
+                <w:sz w:val="20"/>
+                <w:szCs w:val="20"/>
+              </w:rPr>
+              <w:t>OpenRouter</w:t>
+            </w:r>
+            <w:proofErr w:type="spellEnd"/>
+            <w:r>
+              <w:rPr>
+                <w:sz w:val="20"/>
+                <w:szCs w:val="20"/>
+              </w:rPr>
+              <w:t xml:space="preserve">; </w:t>
+            </w:r>
+            <w:proofErr w:type="spellStart"/>
+            <w:r>
+              <w:rPr>
+                <w:sz w:val="20"/>
+                <w:szCs w:val="20"/>
+              </w:rPr>
+              <w:t>max_tokens</w:t>
+            </w:r>
+            <w:proofErr w:type="spellEnd"/>
+            <w:r>
+              <w:rPr>
+                <w:sz w:val="20"/>
+                <w:szCs w:val="20"/>
+              </w:rPr>
+              <w:t>=768, temperature=0.2</w:t>
             </w:r>
           </w:p>
         </w:tc>
@@ -1337,7 +1424,15 @@
         <w:t xml:space="preserve"> </w:t>
       </w:r>
       <w:r>
-        <w:t>The four architectures form a spectrum from minimal orchestration (Single Agent) to full hierarchical multi-agent synthesis with hybrid retrieval (Hybrid Multi-Agent). Each builds on the lessons of the previous one, isolating specific design choices and their effects on the five RAGAS metrics.</w:t>
+        <w:t xml:space="preserve">The four architectures form a spectrum from minimal orchestration (Single Agent) to full hierarchical multi-agent synthesis with hybrid retrieval (Hybrid Multi-Agent). Each </w:t>
+      </w:r>
+      <w:proofErr w:type="gramStart"/>
+      <w:r>
+        <w:t>builds</w:t>
+      </w:r>
+      <w:proofErr w:type="gramEnd"/>
+      <w:r>
+        <w:t xml:space="preserve"> on the lessons of the previous one, isolating specific design choices and their effects on the five RAGAS metrics.</w:t>
       </w:r>
     </w:p>
     <w:p>
@@ -1431,7 +1526,39 @@
         <w:jc w:val="both"/>
       </w:pPr>
       <w:r>
-        <w:t>The pipeline begins with a keyword-based metadata filter that extracts the likely legal domain (Divorce or Inheritance) and jurisdiction (Italy, Estonia, or Slovenia) directly from the surface form of the query using pattern matching. These filters are applied as pre-conditions on the FAISS search, narrowing the candidate pool before vector similarity is computed. The top_k candidates are retrieved, optionally reranked by cosine similarity to produce a final top_k_final documents, and all ten are concatenated into a single context window for the LLM.</w:t>
+        <w:t xml:space="preserve">The pipeline begins with a keyword-based metadata filter that extracts the likely legal domain (Divorce or Inheritance) and jurisdiction (Italy, Estonia, or Slovenia) directly from the surface form of the query using pattern matching. These filters are applied as pre-conditions on the FAISS search, narrowing the candidate pool before vector similarity is computed. The </w:t>
+      </w:r>
+      <w:proofErr w:type="spellStart"/>
+      <w:r>
+        <w:t>top_k</w:t>
+      </w:r>
+      <w:proofErr w:type="spellEnd"/>
+      <w:r>
+        <w:t xml:space="preserve"> candidates are retrieved, optionally reranked by cosine similarity to </w:t>
+      </w:r>
+      <w:proofErr w:type="gramStart"/>
+      <w:r>
+        <w:t>produce</w:t>
+      </w:r>
+      <w:proofErr w:type="gramEnd"/>
+      <w:r>
+        <w:t xml:space="preserve"> a </w:t>
+      </w:r>
+      <w:proofErr w:type="gramStart"/>
+      <w:r>
+        <w:t xml:space="preserve">final </w:t>
+      </w:r>
+      <w:proofErr w:type="spellStart"/>
+      <w:r>
+        <w:t>top_k_final</w:t>
+      </w:r>
+      <w:proofErr w:type="spellEnd"/>
+      <w:r>
+        <w:t xml:space="preserve"> documents</w:t>
+      </w:r>
+      <w:proofErr w:type="gramEnd"/>
+      <w:r>
+        <w:t>, and all ten are concatenated into a single context window for the LLM.</w:t>
       </w:r>
     </w:p>
     <w:p>
@@ -1440,7 +1567,15 @@
         <w:jc w:val="both"/>
       </w:pPr>
       <w:r>
-        <w:t xml:space="preserve">This architecture achieves the highest answer correctness score  across all configurations, likely because the model receives the full, unpartitioned set of retrieved documents without any loss introduced by </w:t>
+        <w:t xml:space="preserve">This architecture achieves the highest answer correctness </w:t>
+      </w:r>
+      <w:proofErr w:type="gramStart"/>
+      <w:r>
+        <w:t>score  across</w:t>
+      </w:r>
+      <w:proofErr w:type="gramEnd"/>
+      <w:r>
+        <w:t xml:space="preserve"> all configurations, likely because the model receives the full, unpartitioned set of retrieved documents without any loss introduced by </w:t>
       </w:r>
       <w:r>
         <w:t>summarization</w:t>
@@ -1508,8 +1643,13 @@
       </w:pPr>
       <w:r>
         <w:lastRenderedPageBreak/>
-        <w:t>3.2 Multi-Agent</w:t>
-      </w:r>
+        <w:t xml:space="preserve">3.2 </w:t>
+      </w:r>
+      <w:proofErr w:type="gramStart"/>
+      <w:r>
+        <w:t>Multi-Agent</w:t>
+      </w:r>
+      <w:proofErr w:type="gramEnd"/>
     </w:p>
     <w:p>
       <w:pPr>
@@ -1520,7 +1660,15 @@
         <w:t xml:space="preserve"> </w:t>
       </w:r>
       <w:r>
-        <w:t xml:space="preserve">The Multi-Agent architecture introduces two additional LLM calls on top of the Single Agent: an intelligent router at the front and a supervisor </w:t>
+        <w:t xml:space="preserve">The </w:t>
+      </w:r>
+      <w:proofErr w:type="gramStart"/>
+      <w:r>
+        <w:t>Multi-Agent</w:t>
+      </w:r>
+      <w:proofErr w:type="gramEnd"/>
+      <w:r>
+        <w:t xml:space="preserve"> architecture introduces two additional LLM calls on top of the Single Agent: an intelligent router at the front and a supervisor </w:t>
       </w:r>
       <w:r>
         <w:t>synthesizer</w:t>
@@ -1740,7 +1888,23 @@
         <w:spacing w:before="60" w:after="120"/>
       </w:pPr>
       <w:r>
-        <w:t>It replaces the heuristic filter with a structured LLM metadata extraction step, where the supervisor LLM parses the query into a JSON object conforming to the LEGAL_METADATA_SCHEMA. This schema mandates the law field (Divorce or Inheritance) and optionally extracts additional fields such as civil_codes_used, cost, duration, and nature_of_separation.</w:t>
+        <w:t xml:space="preserve">It replaces the heuristic filter with a structured LLM metadata extraction step, where the supervisor LLM parses the query into a JSON object conforming to the LEGAL_METADATA_SCHEMA. This schema mandates the law field (Divorce or Inheritance) and optionally extracts additional fields such as </w:t>
+      </w:r>
+      <w:proofErr w:type="spellStart"/>
+      <w:r>
+        <w:t>civil_codes_used</w:t>
+      </w:r>
+      <w:proofErr w:type="spellEnd"/>
+      <w:r>
+        <w:t xml:space="preserve">, cost, duration, and </w:t>
+      </w:r>
+      <w:proofErr w:type="spellStart"/>
+      <w:r>
+        <w:t>nature_of_separation</w:t>
+      </w:r>
+      <w:proofErr w:type="spellEnd"/>
+      <w:r>
+        <w:t>.</w:t>
       </w:r>
     </w:p>
     <w:p>
@@ -1771,7 +1935,15 @@
         <w:tab/>
       </w:r>
       <w:r>
-        <w:t xml:space="preserve">if fewer than top_k documents are returned, </w:t>
+        <w:t xml:space="preserve">if fewer than </w:t>
+      </w:r>
+      <w:proofErr w:type="spellStart"/>
+      <w:r>
+        <w:t>top_k</w:t>
+      </w:r>
+      <w:proofErr w:type="spellEnd"/>
+      <w:r>
+        <w:t xml:space="preserve"> documents are returned, </w:t>
       </w:r>
     </w:p>
     <w:p>
@@ -1828,7 +2000,15 @@
         <w:spacing w:before="60" w:after="120"/>
       </w:pPr>
       <w:r>
-        <w:t>This pipeline produces the best retrieval metrics of all architectures: context precision reaches (</w:t>
+        <w:t xml:space="preserve">This pipeline produces the best retrieval metrics of all </w:t>
+      </w:r>
+      <w:proofErr w:type="gramStart"/>
+      <w:r>
+        <w:t>architectures</w:t>
+      </w:r>
+      <w:proofErr w:type="gramEnd"/>
+      <w:r>
+        <w:t>: context precision reaches (</w:t>
       </w:r>
       <w:r>
         <w:t xml:space="preserve">almost </w:t>
@@ -1859,9 +2039,11 @@
       <w:r>
         <w:t xml:space="preserve">higher </w:t>
       </w:r>
+      <w:proofErr w:type="spellStart"/>
       <w:r>
         <w:t>top_k_final</w:t>
       </w:r>
+      <w:proofErr w:type="spellEnd"/>
       <w:r>
         <w:t xml:space="preserve"> value</w:t>
       </w:r>
@@ -1975,7 +2157,15 @@
         </w:drawing>
       </w:r>
       <w:r>
-        <w:t>The Hybrid Multi-Agent architecture resolves the central weakness of plain Hybrid RAG by combining its superior retrieval pipeline with the per-DB sub-agent synthesis of the Multi-Agent architecture. LLM metadata extraction, heuristic DB routing, two-phase FAISS retrieval, BM25+RRF fusion, cosine reranking, and cross-encoder threshold filtering</w:t>
+        <w:t xml:space="preserve">The Hybrid Multi-Agent architecture resolves the central weakness of plain Hybrid RAG by combining its superior retrieval pipeline with the per-DB sub-agent synthesis of the </w:t>
+      </w:r>
+      <w:proofErr w:type="gramStart"/>
+      <w:r>
+        <w:t>Multi-Agent</w:t>
+      </w:r>
+      <w:proofErr w:type="gramEnd"/>
+      <w:r>
+        <w:t xml:space="preserve"> architecture. LLM metadata extraction, heuristic DB routing, two-phase FAISS retrieval, BM25+RRF fusion, cosine reranking, and cross-encoder threshold filtering</w:t>
       </w:r>
       <w:r>
         <w:t xml:space="preserve"> remain the same</w:t>
@@ -2047,7 +2237,48 @@
         <w:jc w:val="both"/>
       </w:pPr>
       <w:r>
-        <w:t>The optimal hyperparameter configuration is top_k=15, top_k_final=10. This setting provides sufficient retrieval breadth for good context recall (0.800) while keeping each sub-agent's context window small enough to maintain high faithfulness and relevancy. Increasing to top_k=20 or top_k=30 degrades both faithfulness and relevancy monotonically, confirming that the performance optimum lies at the compact end of the context size range. The mean RAGAS score of 0.784 makes this the highest-performing configuration overall, and the only one to exceed the 0.80 threshold simultaneously on three metrics.</w:t>
+        <w:t xml:space="preserve">The optimal hyperparameter configuration is </w:t>
+      </w:r>
+      <w:proofErr w:type="spellStart"/>
+      <w:r>
+        <w:t>top_k</w:t>
+      </w:r>
+      <w:proofErr w:type="spellEnd"/>
+      <w:r>
+        <w:t xml:space="preserve">=15, </w:t>
+      </w:r>
+      <w:proofErr w:type="spellStart"/>
+      <w:r>
+        <w:t>top_k_final</w:t>
+      </w:r>
+      <w:proofErr w:type="spellEnd"/>
+      <w:r>
+        <w:t xml:space="preserve">=10. This setting provides sufficient retrieval breadth for good context recall while keeping each sub-agent's context window small enough to maintain high faithfulness and relevancy. </w:t>
+      </w:r>
+    </w:p>
+    <w:p>
+      <w:pPr>
+        <w:spacing w:before="60" w:after="120"/>
+        <w:jc w:val="both"/>
+      </w:pPr>
+      <w:r>
+        <w:t xml:space="preserve">Increasing to </w:t>
+      </w:r>
+      <w:proofErr w:type="spellStart"/>
+      <w:r>
+        <w:t>top_k</w:t>
+      </w:r>
+      <w:proofErr w:type="spellEnd"/>
+      <w:r>
+        <w:t xml:space="preserve">=20 or </w:t>
+      </w:r>
+      <w:proofErr w:type="spellStart"/>
+      <w:r>
+        <w:t>top_k</w:t>
+      </w:r>
+      <w:proofErr w:type="spellEnd"/>
+      <w:r>
+        <w:t xml:space="preserve">=30 degrades both faithfulness and relevancy monotonically, confirming that the performance optimum lies at the compact end of the context size range. </w:t>
       </w:r>
     </w:p>
     <w:p>
@@ -2084,9 +2315,20 @@
     <w:p>
       <w:pPr>
         <w:spacing w:before="60" w:after="120"/>
+        <w:jc w:val="both"/>
       </w:pPr>
       <w:r>
         <w:t>All metrics scored on [0, 1]. The target threshold is 0.80. Bold values indicate the best per column.</w:t>
+      </w:r>
+      <w:r>
+        <w:br/>
+        <w:t>These metrics were obtained by comparing against the ground truth (GT) of each question that were kept hidden in the site [</w:t>
+      </w:r>
+      <w:r>
+        <w:t>https://textmining_exam.idealunina.work</w:t>
+      </w:r>
+      <w:r>
+        <w:t>] for ragas evaluations.</w:t>
       </w:r>
     </w:p>
     <w:p>
@@ -2112,13 +2354,13 @@
         <w:tblLook w:val="04A0" w:firstRow="1" w:lastRow="0" w:firstColumn="1" w:lastColumn="0" w:noHBand="0" w:noVBand="1"/>
       </w:tblPr>
       <w:tblGrid>
-        <w:gridCol w:w="3576"/>
-        <w:gridCol w:w="916"/>
-        <w:gridCol w:w="966"/>
-        <w:gridCol w:w="916"/>
-        <w:gridCol w:w="918"/>
-        <w:gridCol w:w="1118"/>
-        <w:gridCol w:w="950"/>
+        <w:gridCol w:w="3096"/>
+        <w:gridCol w:w="1033"/>
+        <w:gridCol w:w="1033"/>
+        <w:gridCol w:w="1033"/>
+        <w:gridCol w:w="1095"/>
+        <w:gridCol w:w="1033"/>
+        <w:gridCol w:w="1037"/>
       </w:tblGrid>
       <w:tr>
         <w:tblPrEx>
@@ -2184,6 +2426,7 @@
             <w:pPr>
               <w:jc w:val="center"/>
             </w:pPr>
+            <w:proofErr w:type="spellStart"/>
             <w:r>
               <w:rPr>
                 <w:b/>
@@ -2194,6 +2437,7 @@
               </w:rPr>
               <w:t>Prec</w:t>
             </w:r>
+            <w:proofErr w:type="spellEnd"/>
           </w:p>
         </w:tc>
         <w:tc>
@@ -2283,6 +2527,7 @@
             <w:pPr>
               <w:jc w:val="center"/>
             </w:pPr>
+            <w:proofErr w:type="spellStart"/>
             <w:r>
               <w:rPr>
                 <w:b/>
@@ -2293,6 +2538,7 @@
               </w:rPr>
               <w:t>Relev</w:t>
             </w:r>
+            <w:proofErr w:type="spellEnd"/>
           </w:p>
         </w:tc>
         <w:tc>
@@ -2389,8 +2635,6 @@
           <w:p>
             <w:r>
               <w:rPr>
-                <w:b/>
-                <w:bCs/>
                 <w:sz w:val="20"/>
                 <w:szCs w:val="20"/>
               </w:rPr>
@@ -2545,6 +2789,21 @@
                 <w:szCs w:val="20"/>
               </w:rPr>
               <w:t>0.695</w:t>
+            </w:r>
+            <w:r>
+              <w:rPr>
+                <w:sz w:val="20"/>
+                <w:szCs w:val="20"/>
+              </w:rPr>
+              <w:t xml:space="preserve"> </w:t>
+            </w:r>
+            <w:r>
+              <w:rPr>
+                <w:rFonts w:ascii="Segoe UI Symbol" w:hAnsi="Segoe UI Symbol" w:cs="Segoe UI Symbol"/>
+                <w:sz w:val="20"/>
+                <w:szCs w:val="20"/>
+              </w:rPr>
+              <w:t>★</w:t>
             </w:r>
           </w:p>
         </w:tc>
@@ -2595,36 +2854,34 @@
               <w:bottom w:val="single" w:sz="1" w:space="0" w:color="AAAAAA"/>
               <w:right w:val="single" w:sz="1" w:space="0" w:color="AAAAAA"/>
             </w:tcBorders>
-            <w:shd w:val="clear" w:color="auto" w:fill="EFF6FF"/>
-            <w:tcMar>
-              <w:top w:w="80" w:type="dxa"/>
-              <w:left w:w="120" w:type="dxa"/>
-              <w:bottom w:w="80" w:type="dxa"/>
-              <w:right w:w="120" w:type="dxa"/>
-            </w:tcMar>
-          </w:tcPr>
-          <w:p>
-            <w:r>
-              <w:rPr>
-                <w:b/>
-                <w:bCs/>
-                <w:sz w:val="20"/>
-                <w:szCs w:val="20"/>
-              </w:rPr>
-              <w:t>Multi Agent (10/7)</w:t>
-            </w:r>
-          </w:p>
-        </w:tc>
-        <w:tc>
-          <w:tcPr>
-            <w:tcW w:w="0" w:type="auto"/>
-            <w:tcBorders>
-              <w:top w:val="single" w:sz="1" w:space="0" w:color="AAAAAA"/>
-              <w:left w:val="single" w:sz="1" w:space="0" w:color="AAAAAA"/>
-              <w:bottom w:val="single" w:sz="1" w:space="0" w:color="AAAAAA"/>
-              <w:right w:val="single" w:sz="1" w:space="0" w:color="AAAAAA"/>
-            </w:tcBorders>
-            <w:shd w:val="clear" w:color="auto" w:fill="EFF6FF"/>
+            <w:shd w:val="clear" w:color="auto" w:fill="FFFFFF"/>
+            <w:tcMar>
+              <w:top w:w="80" w:type="dxa"/>
+              <w:left w:w="120" w:type="dxa"/>
+              <w:bottom w:w="80" w:type="dxa"/>
+              <w:right w:w="120" w:type="dxa"/>
+            </w:tcMar>
+          </w:tcPr>
+          <w:p>
+            <w:r>
+              <w:rPr>
+                <w:sz w:val="20"/>
+                <w:szCs w:val="20"/>
+              </w:rPr>
+              <w:t>Multi Agent (30/10)</w:t>
+            </w:r>
+          </w:p>
+        </w:tc>
+        <w:tc>
+          <w:tcPr>
+            <w:tcW w:w="0" w:type="auto"/>
+            <w:tcBorders>
+              <w:top w:val="single" w:sz="1" w:space="0" w:color="AAAAAA"/>
+              <w:left w:val="single" w:sz="1" w:space="0" w:color="AAAAAA"/>
+              <w:bottom w:val="single" w:sz="1" w:space="0" w:color="AAAAAA"/>
+              <w:right w:val="single" w:sz="1" w:space="0" w:color="AAAAAA"/>
+            </w:tcBorders>
+            <w:shd w:val="clear" w:color="auto" w:fill="FFFFFF"/>
             <w:tcMar>
               <w:top w:w="80" w:type="dxa"/>
               <w:left w:w="120" w:type="dxa"/>
@@ -2654,7 +2911,7 @@
               <w:bottom w:val="single" w:sz="1" w:space="0" w:color="AAAAAA"/>
               <w:right w:val="single" w:sz="1" w:space="0" w:color="AAAAAA"/>
             </w:tcBorders>
-            <w:shd w:val="clear" w:color="auto" w:fill="EFF6FF"/>
+            <w:shd w:val="clear" w:color="auto" w:fill="FFFFFF"/>
             <w:tcMar>
               <w:top w:w="80" w:type="dxa"/>
               <w:left w:w="120" w:type="dxa"/>
@@ -2671,20 +2928,20 @@
                 <w:sz w:val="20"/>
                 <w:szCs w:val="20"/>
               </w:rPr>
-              <w:t>0.733</w:t>
-            </w:r>
-          </w:p>
-        </w:tc>
-        <w:tc>
-          <w:tcPr>
-            <w:tcW w:w="0" w:type="auto"/>
-            <w:tcBorders>
-              <w:top w:val="single" w:sz="1" w:space="0" w:color="AAAAAA"/>
-              <w:left w:val="single" w:sz="1" w:space="0" w:color="AAAAAA"/>
-              <w:bottom w:val="single" w:sz="1" w:space="0" w:color="AAAAAA"/>
-              <w:right w:val="single" w:sz="1" w:space="0" w:color="AAAAAA"/>
-            </w:tcBorders>
-            <w:shd w:val="clear" w:color="auto" w:fill="EFF6FF"/>
+              <w:t>0.767</w:t>
+            </w:r>
+          </w:p>
+        </w:tc>
+        <w:tc>
+          <w:tcPr>
+            <w:tcW w:w="0" w:type="auto"/>
+            <w:tcBorders>
+              <w:top w:val="single" w:sz="1" w:space="0" w:color="AAAAAA"/>
+              <w:left w:val="single" w:sz="1" w:space="0" w:color="AAAAAA"/>
+              <w:bottom w:val="single" w:sz="1" w:space="0" w:color="AAAAAA"/>
+              <w:right w:val="single" w:sz="1" w:space="0" w:color="AAAAAA"/>
+            </w:tcBorders>
+            <w:shd w:val="clear" w:color="auto" w:fill="FFFFFF"/>
             <w:tcMar>
               <w:top w:w="80" w:type="dxa"/>
               <w:left w:w="120" w:type="dxa"/>
@@ -2701,20 +2958,20 @@
                 <w:sz w:val="20"/>
                 <w:szCs w:val="20"/>
               </w:rPr>
-              <w:t>0.805</w:t>
-            </w:r>
-          </w:p>
-        </w:tc>
-        <w:tc>
-          <w:tcPr>
-            <w:tcW w:w="0" w:type="auto"/>
-            <w:tcBorders>
-              <w:top w:val="single" w:sz="1" w:space="0" w:color="AAAAAA"/>
-              <w:left w:val="single" w:sz="1" w:space="0" w:color="AAAAAA"/>
-              <w:bottom w:val="single" w:sz="1" w:space="0" w:color="AAAAAA"/>
-              <w:right w:val="single" w:sz="1" w:space="0" w:color="AAAAAA"/>
-            </w:tcBorders>
-            <w:shd w:val="clear" w:color="auto" w:fill="EFF6FF"/>
+              <w:t>0.653</w:t>
+            </w:r>
+          </w:p>
+        </w:tc>
+        <w:tc>
+          <w:tcPr>
+            <w:tcW w:w="0" w:type="auto"/>
+            <w:tcBorders>
+              <w:top w:val="single" w:sz="1" w:space="0" w:color="AAAAAA"/>
+              <w:left w:val="single" w:sz="1" w:space="0" w:color="AAAAAA"/>
+              <w:bottom w:val="single" w:sz="1" w:space="0" w:color="AAAAAA"/>
+              <w:right w:val="single" w:sz="1" w:space="0" w:color="AAAAAA"/>
+            </w:tcBorders>
+            <w:shd w:val="clear" w:color="auto" w:fill="FFFFFF"/>
             <w:tcMar>
               <w:top w:w="80" w:type="dxa"/>
               <w:left w:w="120" w:type="dxa"/>
@@ -2731,20 +2988,20 @@
                 <w:sz w:val="20"/>
                 <w:szCs w:val="20"/>
               </w:rPr>
-              <w:t>0.820</w:t>
-            </w:r>
-          </w:p>
-        </w:tc>
-        <w:tc>
-          <w:tcPr>
-            <w:tcW w:w="0" w:type="auto"/>
-            <w:tcBorders>
-              <w:top w:val="single" w:sz="1" w:space="0" w:color="AAAAAA"/>
-              <w:left w:val="single" w:sz="1" w:space="0" w:color="AAAAAA"/>
-              <w:bottom w:val="single" w:sz="1" w:space="0" w:color="AAAAAA"/>
-              <w:right w:val="single" w:sz="1" w:space="0" w:color="AAAAAA"/>
-            </w:tcBorders>
-            <w:shd w:val="clear" w:color="auto" w:fill="EFF6FF"/>
+              <w:t>0.810</w:t>
+            </w:r>
+          </w:p>
+        </w:tc>
+        <w:tc>
+          <w:tcPr>
+            <w:tcW w:w="0" w:type="auto"/>
+            <w:tcBorders>
+              <w:top w:val="single" w:sz="1" w:space="0" w:color="AAAAAA"/>
+              <w:left w:val="single" w:sz="1" w:space="0" w:color="AAAAAA"/>
+              <w:bottom w:val="single" w:sz="1" w:space="0" w:color="AAAAAA"/>
+              <w:right w:val="single" w:sz="1" w:space="0" w:color="AAAAAA"/>
+            </w:tcBorders>
+            <w:shd w:val="clear" w:color="auto" w:fill="FFFFFF"/>
             <w:tcMar>
               <w:top w:w="80" w:type="dxa"/>
               <w:left w:w="120" w:type="dxa"/>
@@ -2761,20 +3018,20 @@
                 <w:sz w:val="20"/>
                 <w:szCs w:val="20"/>
               </w:rPr>
-              <w:t>0.627</w:t>
-            </w:r>
-          </w:p>
-        </w:tc>
-        <w:tc>
-          <w:tcPr>
-            <w:tcW w:w="0" w:type="auto"/>
-            <w:tcBorders>
-              <w:top w:val="single" w:sz="1" w:space="0" w:color="AAAAAA"/>
-              <w:left w:val="single" w:sz="1" w:space="0" w:color="AAAAAA"/>
-              <w:bottom w:val="single" w:sz="1" w:space="0" w:color="AAAAAA"/>
-              <w:right w:val="single" w:sz="1" w:space="0" w:color="AAAAAA"/>
-            </w:tcBorders>
-            <w:shd w:val="clear" w:color="auto" w:fill="EFF6FF"/>
+              <w:t>0.628</w:t>
+            </w:r>
+          </w:p>
+        </w:tc>
+        <w:tc>
+          <w:tcPr>
+            <w:tcW w:w="0" w:type="auto"/>
+            <w:tcBorders>
+              <w:top w:val="single" w:sz="1" w:space="0" w:color="AAAAAA"/>
+              <w:left w:val="single" w:sz="1" w:space="0" w:color="AAAAAA"/>
+              <w:bottom w:val="single" w:sz="1" w:space="0" w:color="AAAAAA"/>
+              <w:right w:val="single" w:sz="1" w:space="0" w:color="AAAAAA"/>
+            </w:tcBorders>
+            <w:shd w:val="clear" w:color="auto" w:fill="FFFFFF"/>
             <w:tcMar>
               <w:top w:w="80" w:type="dxa"/>
               <w:left w:w="120" w:type="dxa"/>
@@ -2791,7 +3048,7 @@
                 <w:sz w:val="20"/>
                 <w:szCs w:val="20"/>
               </w:rPr>
-              <w:t>0.757</w:t>
+              <w:t>0.732</w:t>
             </w:r>
           </w:p>
         </w:tc>
@@ -2812,36 +3069,34 @@
               <w:bottom w:val="single" w:sz="1" w:space="0" w:color="AAAAAA"/>
               <w:right w:val="single" w:sz="1" w:space="0" w:color="AAAAAA"/>
             </w:tcBorders>
-            <w:shd w:val="clear" w:color="auto" w:fill="FFFFFF"/>
-            <w:tcMar>
-              <w:top w:w="80" w:type="dxa"/>
-              <w:left w:w="120" w:type="dxa"/>
-              <w:bottom w:w="80" w:type="dxa"/>
-              <w:right w:w="120" w:type="dxa"/>
-            </w:tcMar>
-          </w:tcPr>
-          <w:p>
-            <w:r>
-              <w:rPr>
-                <w:b/>
-                <w:bCs/>
-                <w:sz w:val="20"/>
-                <w:szCs w:val="20"/>
-              </w:rPr>
-              <w:t>Multi Agent (30/10)</w:t>
-            </w:r>
-          </w:p>
-        </w:tc>
-        <w:tc>
-          <w:tcPr>
-            <w:tcW w:w="0" w:type="auto"/>
-            <w:tcBorders>
-              <w:top w:val="single" w:sz="1" w:space="0" w:color="AAAAAA"/>
-              <w:left w:val="single" w:sz="1" w:space="0" w:color="AAAAAA"/>
-              <w:bottom w:val="single" w:sz="1" w:space="0" w:color="AAAAAA"/>
-              <w:right w:val="single" w:sz="1" w:space="0" w:color="AAAAAA"/>
-            </w:tcBorders>
-            <w:shd w:val="clear" w:color="auto" w:fill="FFFFFF"/>
+            <w:shd w:val="clear" w:color="auto" w:fill="EFF6FF"/>
+            <w:tcMar>
+              <w:top w:w="80" w:type="dxa"/>
+              <w:left w:w="120" w:type="dxa"/>
+              <w:bottom w:w="80" w:type="dxa"/>
+              <w:right w:w="120" w:type="dxa"/>
+            </w:tcMar>
+          </w:tcPr>
+          <w:p>
+            <w:r>
+              <w:rPr>
+                <w:sz w:val="20"/>
+                <w:szCs w:val="20"/>
+              </w:rPr>
+              <w:t>Hybrid (30/10)</w:t>
+            </w:r>
+          </w:p>
+        </w:tc>
+        <w:tc>
+          <w:tcPr>
+            <w:tcW w:w="0" w:type="auto"/>
+            <w:tcBorders>
+              <w:top w:val="single" w:sz="1" w:space="0" w:color="AAAAAA"/>
+              <w:left w:val="single" w:sz="1" w:space="0" w:color="AAAAAA"/>
+              <w:bottom w:val="single" w:sz="1" w:space="0" w:color="AAAAAA"/>
+              <w:right w:val="single" w:sz="1" w:space="0" w:color="AAAAAA"/>
+            </w:tcBorders>
+            <w:shd w:val="clear" w:color="auto" w:fill="EFF6FF"/>
             <w:tcMar>
               <w:top w:w="80" w:type="dxa"/>
               <w:left w:w="120" w:type="dxa"/>
@@ -2858,20 +3113,35 @@
                 <w:sz w:val="20"/>
                 <w:szCs w:val="20"/>
               </w:rPr>
-              <w:t>0.800</w:t>
-            </w:r>
-          </w:p>
-        </w:tc>
-        <w:tc>
-          <w:tcPr>
-            <w:tcW w:w="0" w:type="auto"/>
-            <w:tcBorders>
-              <w:top w:val="single" w:sz="1" w:space="0" w:color="AAAAAA"/>
-              <w:left w:val="single" w:sz="1" w:space="0" w:color="AAAAAA"/>
-              <w:bottom w:val="single" w:sz="1" w:space="0" w:color="AAAAAA"/>
-              <w:right w:val="single" w:sz="1" w:space="0" w:color="AAAAAA"/>
-            </w:tcBorders>
-            <w:shd w:val="clear" w:color="auto" w:fill="FFFFFF"/>
+              <w:t>1.000</w:t>
+            </w:r>
+            <w:r>
+              <w:rPr>
+                <w:sz w:val="20"/>
+                <w:szCs w:val="20"/>
+              </w:rPr>
+              <w:t xml:space="preserve"> </w:t>
+            </w:r>
+            <w:r>
+              <w:rPr>
+                <w:rFonts w:ascii="Segoe UI Symbol" w:hAnsi="Segoe UI Symbol" w:cs="Segoe UI Symbol"/>
+                <w:sz w:val="20"/>
+                <w:szCs w:val="20"/>
+              </w:rPr>
+              <w:t>★</w:t>
+            </w:r>
+          </w:p>
+        </w:tc>
+        <w:tc>
+          <w:tcPr>
+            <w:tcW w:w="0" w:type="auto"/>
+            <w:tcBorders>
+              <w:top w:val="single" w:sz="1" w:space="0" w:color="AAAAAA"/>
+              <w:left w:val="single" w:sz="1" w:space="0" w:color="AAAAAA"/>
+              <w:bottom w:val="single" w:sz="1" w:space="0" w:color="AAAAAA"/>
+              <w:right w:val="single" w:sz="1" w:space="0" w:color="AAAAAA"/>
+            </w:tcBorders>
+            <w:shd w:val="clear" w:color="auto" w:fill="EFF6FF"/>
             <w:tcMar>
               <w:top w:w="80" w:type="dxa"/>
               <w:left w:w="120" w:type="dxa"/>
@@ -2888,20 +3158,35 @@
                 <w:sz w:val="20"/>
                 <w:szCs w:val="20"/>
               </w:rPr>
-              <w:t>0.767</w:t>
-            </w:r>
-          </w:p>
-        </w:tc>
-        <w:tc>
-          <w:tcPr>
-            <w:tcW w:w="0" w:type="auto"/>
-            <w:tcBorders>
-              <w:top w:val="single" w:sz="1" w:space="0" w:color="AAAAAA"/>
-              <w:left w:val="single" w:sz="1" w:space="0" w:color="AAAAAA"/>
-              <w:bottom w:val="single" w:sz="1" w:space="0" w:color="AAAAAA"/>
-              <w:right w:val="single" w:sz="1" w:space="0" w:color="AAAAAA"/>
-            </w:tcBorders>
-            <w:shd w:val="clear" w:color="auto" w:fill="FFFFFF"/>
+              <w:t>0.867</w:t>
+            </w:r>
+            <w:r>
+              <w:rPr>
+                <w:sz w:val="20"/>
+                <w:szCs w:val="20"/>
+              </w:rPr>
+              <w:t xml:space="preserve"> </w:t>
+            </w:r>
+            <w:r>
+              <w:rPr>
+                <w:rFonts w:ascii="Segoe UI Symbol" w:hAnsi="Segoe UI Symbol" w:cs="Segoe UI Symbol"/>
+                <w:sz w:val="20"/>
+                <w:szCs w:val="20"/>
+              </w:rPr>
+              <w:t>★</w:t>
+            </w:r>
+          </w:p>
+        </w:tc>
+        <w:tc>
+          <w:tcPr>
+            <w:tcW w:w="0" w:type="auto"/>
+            <w:tcBorders>
+              <w:top w:val="single" w:sz="1" w:space="0" w:color="AAAAAA"/>
+              <w:left w:val="single" w:sz="1" w:space="0" w:color="AAAAAA"/>
+              <w:bottom w:val="single" w:sz="1" w:space="0" w:color="AAAAAA"/>
+              <w:right w:val="single" w:sz="1" w:space="0" w:color="AAAAAA"/>
+            </w:tcBorders>
+            <w:shd w:val="clear" w:color="auto" w:fill="EFF6FF"/>
             <w:tcMar>
               <w:top w:w="80" w:type="dxa"/>
               <w:left w:w="120" w:type="dxa"/>
@@ -2918,20 +3203,20 @@
                 <w:sz w:val="20"/>
                 <w:szCs w:val="20"/>
               </w:rPr>
-              <w:t>0.653</w:t>
-            </w:r>
-          </w:p>
-        </w:tc>
-        <w:tc>
-          <w:tcPr>
-            <w:tcW w:w="0" w:type="auto"/>
-            <w:tcBorders>
-              <w:top w:val="single" w:sz="1" w:space="0" w:color="AAAAAA"/>
-              <w:left w:val="single" w:sz="1" w:space="0" w:color="AAAAAA"/>
-              <w:bottom w:val="single" w:sz="1" w:space="0" w:color="AAAAAA"/>
-              <w:right w:val="single" w:sz="1" w:space="0" w:color="AAAAAA"/>
-            </w:tcBorders>
-            <w:shd w:val="clear" w:color="auto" w:fill="FFFFFF"/>
+              <w:t>0.633</w:t>
+            </w:r>
+          </w:p>
+        </w:tc>
+        <w:tc>
+          <w:tcPr>
+            <w:tcW w:w="0" w:type="auto"/>
+            <w:tcBorders>
+              <w:top w:val="single" w:sz="1" w:space="0" w:color="AAAAAA"/>
+              <w:left w:val="single" w:sz="1" w:space="0" w:color="AAAAAA"/>
+              <w:bottom w:val="single" w:sz="1" w:space="0" w:color="AAAAAA"/>
+              <w:right w:val="single" w:sz="1" w:space="0" w:color="AAAAAA"/>
+            </w:tcBorders>
+            <w:shd w:val="clear" w:color="auto" w:fill="EFF6FF"/>
             <w:tcMar>
               <w:top w:w="80" w:type="dxa"/>
               <w:left w:w="120" w:type="dxa"/>
@@ -2948,20 +3233,20 @@
                 <w:sz w:val="20"/>
                 <w:szCs w:val="20"/>
               </w:rPr>
-              <w:t>0.810</w:t>
-            </w:r>
-          </w:p>
-        </w:tc>
-        <w:tc>
-          <w:tcPr>
-            <w:tcW w:w="0" w:type="auto"/>
-            <w:tcBorders>
-              <w:top w:val="single" w:sz="1" w:space="0" w:color="AAAAAA"/>
-              <w:left w:val="single" w:sz="1" w:space="0" w:color="AAAAAA"/>
-              <w:bottom w:val="single" w:sz="1" w:space="0" w:color="AAAAAA"/>
-              <w:right w:val="single" w:sz="1" w:space="0" w:color="AAAAAA"/>
-            </w:tcBorders>
-            <w:shd w:val="clear" w:color="auto" w:fill="FFFFFF"/>
+              <w:t>0.486</w:t>
+            </w:r>
+          </w:p>
+        </w:tc>
+        <w:tc>
+          <w:tcPr>
+            <w:tcW w:w="0" w:type="auto"/>
+            <w:tcBorders>
+              <w:top w:val="single" w:sz="1" w:space="0" w:color="AAAAAA"/>
+              <w:left w:val="single" w:sz="1" w:space="0" w:color="AAAAAA"/>
+              <w:bottom w:val="single" w:sz="1" w:space="0" w:color="AAAAAA"/>
+              <w:right w:val="single" w:sz="1" w:space="0" w:color="AAAAAA"/>
+            </w:tcBorders>
+            <w:shd w:val="clear" w:color="auto" w:fill="EFF6FF"/>
             <w:tcMar>
               <w:top w:w="80" w:type="dxa"/>
               <w:left w:w="120" w:type="dxa"/>
@@ -2978,20 +3263,20 @@
                 <w:sz w:val="20"/>
                 <w:szCs w:val="20"/>
               </w:rPr>
-              <w:t>0.628</w:t>
-            </w:r>
-          </w:p>
-        </w:tc>
-        <w:tc>
-          <w:tcPr>
-            <w:tcW w:w="0" w:type="auto"/>
-            <w:tcBorders>
-              <w:top w:val="single" w:sz="1" w:space="0" w:color="AAAAAA"/>
-              <w:left w:val="single" w:sz="1" w:space="0" w:color="AAAAAA"/>
-              <w:bottom w:val="single" w:sz="1" w:space="0" w:color="AAAAAA"/>
-              <w:right w:val="single" w:sz="1" w:space="0" w:color="AAAAAA"/>
-            </w:tcBorders>
-            <w:shd w:val="clear" w:color="auto" w:fill="FFFFFF"/>
+              <w:t>0.608</w:t>
+            </w:r>
+          </w:p>
+        </w:tc>
+        <w:tc>
+          <w:tcPr>
+            <w:tcW w:w="0" w:type="auto"/>
+            <w:tcBorders>
+              <w:top w:val="single" w:sz="1" w:space="0" w:color="AAAAAA"/>
+              <w:left w:val="single" w:sz="1" w:space="0" w:color="AAAAAA"/>
+              <w:bottom w:val="single" w:sz="1" w:space="0" w:color="AAAAAA"/>
+              <w:right w:val="single" w:sz="1" w:space="0" w:color="AAAAAA"/>
+            </w:tcBorders>
+            <w:shd w:val="clear" w:color="auto" w:fill="EFF6FF"/>
             <w:tcMar>
               <w:top w:w="80" w:type="dxa"/>
               <w:left w:w="120" w:type="dxa"/>
@@ -3008,7 +3293,7 @@
                 <w:sz w:val="20"/>
                 <w:szCs w:val="20"/>
               </w:rPr>
-              <w:t>0.732</w:t>
+              <w:t>0.719</w:t>
             </w:r>
           </w:p>
         </w:tc>
@@ -3029,36 +3314,47 @@
               <w:bottom w:val="single" w:sz="1" w:space="0" w:color="AAAAAA"/>
               <w:right w:val="single" w:sz="1" w:space="0" w:color="AAAAAA"/>
             </w:tcBorders>
-            <w:shd w:val="clear" w:color="auto" w:fill="EFF6FF"/>
-            <w:tcMar>
-              <w:top w:w="80" w:type="dxa"/>
-              <w:left w:w="120" w:type="dxa"/>
-              <w:bottom w:w="80" w:type="dxa"/>
-              <w:right w:w="120" w:type="dxa"/>
-            </w:tcMar>
-          </w:tcPr>
-          <w:p>
-            <w:r>
-              <w:rPr>
-                <w:b/>
-                <w:bCs/>
-                <w:sz w:val="20"/>
-                <w:szCs w:val="20"/>
-              </w:rPr>
-              <w:t>Hybrid (30/10)</w:t>
-            </w:r>
-          </w:p>
-        </w:tc>
-        <w:tc>
-          <w:tcPr>
-            <w:tcW w:w="0" w:type="auto"/>
-            <w:tcBorders>
-              <w:top w:val="single" w:sz="1" w:space="0" w:color="AAAAAA"/>
-              <w:left w:val="single" w:sz="1" w:space="0" w:color="AAAAAA"/>
-              <w:bottom w:val="single" w:sz="1" w:space="0" w:color="AAAAAA"/>
-              <w:right w:val="single" w:sz="1" w:space="0" w:color="AAAAAA"/>
-            </w:tcBorders>
-            <w:shd w:val="clear" w:color="auto" w:fill="EFF6FF"/>
+            <w:shd w:val="clear" w:color="auto" w:fill="FFFFFF"/>
+            <w:tcMar>
+              <w:top w:w="80" w:type="dxa"/>
+              <w:left w:w="120" w:type="dxa"/>
+              <w:bottom w:w="80" w:type="dxa"/>
+              <w:right w:w="120" w:type="dxa"/>
+            </w:tcMar>
+          </w:tcPr>
+          <w:p>
+            <w:pPr>
+              <w:rPr>
+                <w:sz w:val="20"/>
+                <w:szCs w:val="20"/>
+              </w:rPr>
+            </w:pPr>
+            <w:r>
+              <w:rPr>
+                <w:sz w:val="20"/>
+                <w:szCs w:val="20"/>
+              </w:rPr>
+              <w:t xml:space="preserve">Hybrid </w:t>
+            </w:r>
+            <w:r>
+              <w:rPr>
+                <w:sz w:val="20"/>
+                <w:szCs w:val="20"/>
+              </w:rPr>
+              <w:t>Multi Agent (10/7)</w:t>
+            </w:r>
+          </w:p>
+        </w:tc>
+        <w:tc>
+          <w:tcPr>
+            <w:tcW w:w="0" w:type="auto"/>
+            <w:tcBorders>
+              <w:top w:val="single" w:sz="1" w:space="0" w:color="AAAAAA"/>
+              <w:left w:val="single" w:sz="1" w:space="0" w:color="AAAAAA"/>
+              <w:bottom w:val="single" w:sz="1" w:space="0" w:color="AAAAAA"/>
+              <w:right w:val="single" w:sz="1" w:space="0" w:color="AAAAAA"/>
+            </w:tcBorders>
+            <w:shd w:val="clear" w:color="auto" w:fill="FFFFFF"/>
             <w:tcMar>
               <w:top w:w="80" w:type="dxa"/>
               <w:left w:w="120" w:type="dxa"/>
@@ -3069,26 +3365,30 @@
           <w:p>
             <w:pPr>
               <w:jc w:val="center"/>
-            </w:pPr>
-            <w:r>
-              <w:rPr>
-                <w:sz w:val="20"/>
-                <w:szCs w:val="20"/>
-              </w:rPr>
-              <w:t>1.000</w:t>
-            </w:r>
-          </w:p>
-        </w:tc>
-        <w:tc>
-          <w:tcPr>
-            <w:tcW w:w="0" w:type="auto"/>
-            <w:tcBorders>
-              <w:top w:val="single" w:sz="1" w:space="0" w:color="AAAAAA"/>
-              <w:left w:val="single" w:sz="1" w:space="0" w:color="AAAAAA"/>
-              <w:bottom w:val="single" w:sz="1" w:space="0" w:color="AAAAAA"/>
-              <w:right w:val="single" w:sz="1" w:space="0" w:color="AAAAAA"/>
-            </w:tcBorders>
-            <w:shd w:val="clear" w:color="auto" w:fill="EFF6FF"/>
+              <w:rPr>
+                <w:sz w:val="20"/>
+                <w:szCs w:val="20"/>
+              </w:rPr>
+            </w:pPr>
+            <w:r>
+              <w:rPr>
+                <w:sz w:val="20"/>
+                <w:szCs w:val="20"/>
+              </w:rPr>
+              <w:t>0.800</w:t>
+            </w:r>
+          </w:p>
+        </w:tc>
+        <w:tc>
+          <w:tcPr>
+            <w:tcW w:w="0" w:type="auto"/>
+            <w:tcBorders>
+              <w:top w:val="single" w:sz="1" w:space="0" w:color="AAAAAA"/>
+              <w:left w:val="single" w:sz="1" w:space="0" w:color="AAAAAA"/>
+              <w:bottom w:val="single" w:sz="1" w:space="0" w:color="AAAAAA"/>
+              <w:right w:val="single" w:sz="1" w:space="0" w:color="AAAAAA"/>
+            </w:tcBorders>
+            <w:shd w:val="clear" w:color="auto" w:fill="FFFFFF"/>
             <w:tcMar>
               <w:top w:w="80" w:type="dxa"/>
               <w:left w:w="120" w:type="dxa"/>
@@ -3099,26 +3399,37 @@
           <w:p>
             <w:pPr>
               <w:jc w:val="center"/>
-            </w:pPr>
-            <w:r>
-              <w:rPr>
-                <w:sz w:val="20"/>
-                <w:szCs w:val="20"/>
-              </w:rPr>
-              <w:t>0.867</w:t>
-            </w:r>
-          </w:p>
-        </w:tc>
-        <w:tc>
-          <w:tcPr>
-            <w:tcW w:w="0" w:type="auto"/>
-            <w:tcBorders>
-              <w:top w:val="single" w:sz="1" w:space="0" w:color="AAAAAA"/>
-              <w:left w:val="single" w:sz="1" w:space="0" w:color="AAAAAA"/>
-              <w:bottom w:val="single" w:sz="1" w:space="0" w:color="AAAAAA"/>
-              <w:right w:val="single" w:sz="1" w:space="0" w:color="AAAAAA"/>
-            </w:tcBorders>
-            <w:shd w:val="clear" w:color="auto" w:fill="EFF6FF"/>
+              <w:rPr>
+                <w:sz w:val="20"/>
+                <w:szCs w:val="20"/>
+              </w:rPr>
+            </w:pPr>
+            <w:r>
+              <w:rPr>
+                <w:sz w:val="20"/>
+                <w:szCs w:val="20"/>
+              </w:rPr>
+              <w:t>0.7</w:t>
+            </w:r>
+            <w:r>
+              <w:rPr>
+                <w:sz w:val="20"/>
+                <w:szCs w:val="20"/>
+              </w:rPr>
+              <w:t>03</w:t>
+            </w:r>
+          </w:p>
+        </w:tc>
+        <w:tc>
+          <w:tcPr>
+            <w:tcW w:w="0" w:type="auto"/>
+            <w:tcBorders>
+              <w:top w:val="single" w:sz="1" w:space="0" w:color="AAAAAA"/>
+              <w:left w:val="single" w:sz="1" w:space="0" w:color="AAAAAA"/>
+              <w:bottom w:val="single" w:sz="1" w:space="0" w:color="AAAAAA"/>
+              <w:right w:val="single" w:sz="1" w:space="0" w:color="AAAAAA"/>
+            </w:tcBorders>
+            <w:shd w:val="clear" w:color="auto" w:fill="FFFFFF"/>
             <w:tcMar>
               <w:top w:w="80" w:type="dxa"/>
               <w:left w:w="120" w:type="dxa"/>
@@ -3129,26 +3440,45 @@
           <w:p>
             <w:pPr>
               <w:jc w:val="center"/>
-            </w:pPr>
-            <w:r>
-              <w:rPr>
-                <w:sz w:val="20"/>
-                <w:szCs w:val="20"/>
-              </w:rPr>
-              <w:t>0.633</w:t>
-            </w:r>
-          </w:p>
-        </w:tc>
-        <w:tc>
-          <w:tcPr>
-            <w:tcW w:w="0" w:type="auto"/>
-            <w:tcBorders>
-              <w:top w:val="single" w:sz="1" w:space="0" w:color="AAAAAA"/>
-              <w:left w:val="single" w:sz="1" w:space="0" w:color="AAAAAA"/>
-              <w:bottom w:val="single" w:sz="1" w:space="0" w:color="AAAAAA"/>
-              <w:right w:val="single" w:sz="1" w:space="0" w:color="AAAAAA"/>
-            </w:tcBorders>
-            <w:shd w:val="clear" w:color="auto" w:fill="EFF6FF"/>
+              <w:rPr>
+                <w:sz w:val="20"/>
+                <w:szCs w:val="20"/>
+              </w:rPr>
+            </w:pPr>
+            <w:r>
+              <w:rPr>
+                <w:sz w:val="20"/>
+                <w:szCs w:val="20"/>
+              </w:rPr>
+              <w:t>0.805</w:t>
+            </w:r>
+            <w:r>
+              <w:rPr>
+                <w:sz w:val="20"/>
+                <w:szCs w:val="20"/>
+              </w:rPr>
+              <w:t xml:space="preserve"> </w:t>
+            </w:r>
+            <w:r>
+              <w:rPr>
+                <w:rFonts w:ascii="Segoe UI Symbol" w:hAnsi="Segoe UI Symbol" w:cs="Segoe UI Symbol"/>
+                <w:sz w:val="20"/>
+                <w:szCs w:val="20"/>
+              </w:rPr>
+              <w:t>★</w:t>
+            </w:r>
+          </w:p>
+        </w:tc>
+        <w:tc>
+          <w:tcPr>
+            <w:tcW w:w="0" w:type="auto"/>
+            <w:tcBorders>
+              <w:top w:val="single" w:sz="1" w:space="0" w:color="AAAAAA"/>
+              <w:left w:val="single" w:sz="1" w:space="0" w:color="AAAAAA"/>
+              <w:bottom w:val="single" w:sz="1" w:space="0" w:color="AAAAAA"/>
+              <w:right w:val="single" w:sz="1" w:space="0" w:color="AAAAAA"/>
+            </w:tcBorders>
+            <w:shd w:val="clear" w:color="auto" w:fill="FFFFFF"/>
             <w:tcMar>
               <w:top w:w="80" w:type="dxa"/>
               <w:left w:w="120" w:type="dxa"/>
@@ -3165,20 +3495,20 @@
                 <w:sz w:val="20"/>
                 <w:szCs w:val="20"/>
               </w:rPr>
-              <w:t>0.486</w:t>
-            </w:r>
-          </w:p>
-        </w:tc>
-        <w:tc>
-          <w:tcPr>
-            <w:tcW w:w="0" w:type="auto"/>
-            <w:tcBorders>
-              <w:top w:val="single" w:sz="1" w:space="0" w:color="AAAAAA"/>
-              <w:left w:val="single" w:sz="1" w:space="0" w:color="AAAAAA"/>
-              <w:bottom w:val="single" w:sz="1" w:space="0" w:color="AAAAAA"/>
-              <w:right w:val="single" w:sz="1" w:space="0" w:color="AAAAAA"/>
-            </w:tcBorders>
-            <w:shd w:val="clear" w:color="auto" w:fill="EFF6FF"/>
+              <w:t>0.820</w:t>
+            </w:r>
+          </w:p>
+        </w:tc>
+        <w:tc>
+          <w:tcPr>
+            <w:tcW w:w="0" w:type="auto"/>
+            <w:tcBorders>
+              <w:top w:val="single" w:sz="1" w:space="0" w:color="AAAAAA"/>
+              <w:left w:val="single" w:sz="1" w:space="0" w:color="AAAAAA"/>
+              <w:bottom w:val="single" w:sz="1" w:space="0" w:color="AAAAAA"/>
+              <w:right w:val="single" w:sz="1" w:space="0" w:color="AAAAAA"/>
+            </w:tcBorders>
+            <w:shd w:val="clear" w:color="auto" w:fill="FFFFFF"/>
             <w:tcMar>
               <w:top w:w="80" w:type="dxa"/>
               <w:left w:w="120" w:type="dxa"/>
@@ -3195,20 +3525,20 @@
                 <w:sz w:val="20"/>
                 <w:szCs w:val="20"/>
               </w:rPr>
-              <w:t>0.608</w:t>
-            </w:r>
-          </w:p>
-        </w:tc>
-        <w:tc>
-          <w:tcPr>
-            <w:tcW w:w="0" w:type="auto"/>
-            <w:tcBorders>
-              <w:top w:val="single" w:sz="1" w:space="0" w:color="AAAAAA"/>
-              <w:left w:val="single" w:sz="1" w:space="0" w:color="AAAAAA"/>
-              <w:bottom w:val="single" w:sz="1" w:space="0" w:color="AAAAAA"/>
-              <w:right w:val="single" w:sz="1" w:space="0" w:color="AAAAAA"/>
-            </w:tcBorders>
-            <w:shd w:val="clear" w:color="auto" w:fill="EFF6FF"/>
+              <w:t>0.627</w:t>
+            </w:r>
+          </w:p>
+        </w:tc>
+        <w:tc>
+          <w:tcPr>
+            <w:tcW w:w="0" w:type="auto"/>
+            <w:tcBorders>
+              <w:top w:val="single" w:sz="1" w:space="0" w:color="AAAAAA"/>
+              <w:left w:val="single" w:sz="1" w:space="0" w:color="AAAAAA"/>
+              <w:bottom w:val="single" w:sz="1" w:space="0" w:color="AAAAAA"/>
+              <w:right w:val="single" w:sz="1" w:space="0" w:color="AAAAAA"/>
+            </w:tcBorders>
+            <w:shd w:val="clear" w:color="auto" w:fill="FFFFFF"/>
             <w:tcMar>
               <w:top w:w="80" w:type="dxa"/>
               <w:left w:w="120" w:type="dxa"/>
@@ -3219,13 +3549,24 @@
           <w:p>
             <w:pPr>
               <w:jc w:val="center"/>
-            </w:pPr>
-            <w:r>
-              <w:rPr>
-                <w:sz w:val="20"/>
-                <w:szCs w:val="20"/>
-              </w:rPr>
-              <w:t>0.719</w:t>
+              <w:rPr>
+                <w:sz w:val="20"/>
+                <w:szCs w:val="20"/>
+              </w:rPr>
+            </w:pPr>
+            <w:r>
+              <w:rPr>
+                <w:sz w:val="20"/>
+                <w:szCs w:val="20"/>
+              </w:rPr>
+              <w:t>0.75</w:t>
+            </w:r>
+            <w:r>
+              <w:rPr>
+                <w:sz w:val="20"/>
+                <w:szCs w:val="20"/>
+              </w:rPr>
+              <w:t xml:space="preserve">1 </w:t>
             </w:r>
           </w:p>
         </w:tc>
@@ -3255,14 +3596,50 @@
             </w:tcMar>
           </w:tcPr>
           <w:p>
-            <w:r>
+            <w:pPr>
               <w:rPr>
                 <w:b/>
                 <w:bCs/>
-                <w:sz w:val="20"/>
-                <w:szCs w:val="20"/>
-              </w:rPr>
-              <w:t>Hybrid Multi-Agent (15/10) ★</w:t>
+              </w:rPr>
+            </w:pPr>
+            <w:r>
+              <w:rPr>
+                <w:b/>
+                <w:bCs/>
+                <w:sz w:val="20"/>
+                <w:szCs w:val="20"/>
+              </w:rPr>
+              <w:t xml:space="preserve">Hybrid </w:t>
+            </w:r>
+            <w:proofErr w:type="gramStart"/>
+            <w:r>
+              <w:rPr>
+                <w:b/>
+                <w:bCs/>
+                <w:sz w:val="20"/>
+                <w:szCs w:val="20"/>
+              </w:rPr>
+              <w:t>Multi-Agent</w:t>
+            </w:r>
+            <w:proofErr w:type="gramEnd"/>
+            <w:r>
+              <w:rPr>
+                <w:b/>
+                <w:bCs/>
+                <w:sz w:val="20"/>
+                <w:szCs w:val="20"/>
+              </w:rPr>
+              <w:t xml:space="preserve"> (15/10) </w:t>
+            </w:r>
+            <w:r>
+              <w:rPr>
+                <w:rFonts w:ascii="Segoe UI Symbol" w:hAnsi="Segoe UI Symbol" w:cs="Segoe UI Symbol"/>
+                <w:b/>
+                <w:bCs/>
+                <w:sz w:val="20"/>
+                <w:szCs w:val="20"/>
+              </w:rPr>
+              <w:t>★</w:t>
             </w:r>
           </w:p>
         </w:tc>
@@ -3286,9 +3663,15 @@
           <w:p>
             <w:pPr>
               <w:jc w:val="center"/>
-            </w:pPr>
-            <w:r>
-              <w:rPr>
+              <w:rPr>
+                <w:b/>
+                <w:bCs/>
+              </w:rPr>
+            </w:pPr>
+            <w:r>
+              <w:rPr>
+                <w:b/>
+                <w:bCs/>
                 <w:sz w:val="20"/>
                 <w:szCs w:val="20"/>
               </w:rPr>
@@ -3316,13 +3699,19 @@
           <w:p>
             <w:pPr>
               <w:jc w:val="center"/>
-            </w:pPr>
-            <w:r>
-              <w:rPr>
-                <w:sz w:val="20"/>
-                <w:szCs w:val="20"/>
-              </w:rPr>
-              <w:t>0.800</w:t>
+              <w:rPr>
+                <w:b/>
+                <w:bCs/>
+              </w:rPr>
+            </w:pPr>
+            <w:r>
+              <w:rPr>
+                <w:b/>
+                <w:bCs/>
+                <w:sz w:val="20"/>
+                <w:szCs w:val="20"/>
+              </w:rPr>
+              <w:t>0.733</w:t>
             </w:r>
           </w:p>
         </w:tc>
@@ -3346,13 +3735,19 @@
           <w:p>
             <w:pPr>
               <w:jc w:val="center"/>
-            </w:pPr>
-            <w:r>
-              <w:rPr>
-                <w:sz w:val="20"/>
-                <w:szCs w:val="20"/>
-              </w:rPr>
-              <w:t>0.812</w:t>
+              <w:rPr>
+                <w:b/>
+                <w:bCs/>
+              </w:rPr>
+            </w:pPr>
+            <w:r>
+              <w:rPr>
+                <w:b/>
+                <w:bCs/>
+                <w:sz w:val="20"/>
+                <w:szCs w:val="20"/>
+              </w:rPr>
+              <w:t>0.753</w:t>
             </w:r>
           </w:p>
         </w:tc>
@@ -3376,14 +3771,35 @@
           <w:p>
             <w:pPr>
               <w:jc w:val="center"/>
-            </w:pPr>
-            <w:r>
-              <w:rPr>
-                <w:sz w:val="20"/>
-                <w:szCs w:val="20"/>
+              <w:rPr>
+                <w:b/>
+                <w:bCs/>
+              </w:rPr>
+            </w:pPr>
+            <w:r>
+              <w:rPr>
+                <w:b/>
+                <w:bCs/>
               </w:rPr>
               <w:t>0.826</w:t>
             </w:r>
+            <w:r>
+              <w:rPr>
+                <w:b/>
+                <w:bCs/>
+              </w:rPr>
+              <w:t xml:space="preserve"> </w:t>
+            </w:r>
+            <w:r>
+              <w:rPr>
+                <w:rFonts w:ascii="Segoe UI Symbol" w:hAnsi="Segoe UI Symbol" w:cs="Segoe UI Symbol"/>
+                <w:b/>
+                <w:bCs/>
+                <w:sz w:val="20"/>
+                <w:szCs w:val="20"/>
+              </w:rPr>
+              <w:t>★</w:t>
+            </w:r>
           </w:p>
         </w:tc>
         <w:tc>
@@ -3406,13 +3822,17 @@
           <w:p>
             <w:pPr>
               <w:jc w:val="center"/>
-            </w:pPr>
-            <w:r>
-              <w:rPr>
-                <w:sz w:val="20"/>
-                <w:szCs w:val="20"/>
-              </w:rPr>
-              <w:t>0.680</w:t>
+              <w:rPr>
+                <w:b/>
+                <w:bCs/>
+              </w:rPr>
+            </w:pPr>
+            <w:r>
+              <w:rPr>
+                <w:b/>
+                <w:bCs/>
+              </w:rPr>
+              <w:t>0.659</w:t>
             </w:r>
           </w:p>
         </w:tc>
@@ -3436,13 +3856,29 @@
           <w:p>
             <w:pPr>
               <w:jc w:val="center"/>
-            </w:pPr>
-            <w:r>
-              <w:rPr>
-                <w:sz w:val="20"/>
-                <w:szCs w:val="20"/>
-              </w:rPr>
-              <w:t>0.784</w:t>
+              <w:rPr>
+                <w:b/>
+                <w:bCs/>
+              </w:rPr>
+            </w:pPr>
+            <w:r>
+              <w:rPr>
+                <w:b/>
+                <w:bCs/>
+                <w:sz w:val="20"/>
+                <w:szCs w:val="20"/>
+              </w:rPr>
+              <w:t xml:space="preserve">0.754 </w:t>
+            </w:r>
+            <w:r>
+              <w:rPr>
+                <w:rFonts w:ascii="Segoe UI Symbol" w:hAnsi="Segoe UI Symbol" w:cs="Segoe UI Symbol"/>
+                <w:b/>
+                <w:bCs/>
+                <w:sz w:val="20"/>
+                <w:szCs w:val="20"/>
+              </w:rPr>
+              <w:t>★</w:t>
             </w:r>
           </w:p>
         </w:tc>
@@ -3474,12 +3910,26 @@
           <w:p>
             <w:r>
               <w:rPr>
-                <w:b/>
-                <w:bCs/>
-                <w:sz w:val="20"/>
-                <w:szCs w:val="20"/>
-              </w:rPr>
-              <w:t>Hybrid Multi-Agent (20/10)</w:t>
+                <w:sz w:val="20"/>
+                <w:szCs w:val="20"/>
+              </w:rPr>
+              <w:t xml:space="preserve">Hybrid </w:t>
+            </w:r>
+            <w:proofErr w:type="gramStart"/>
+            <w:r>
+              <w:rPr>
+                <w:sz w:val="20"/>
+                <w:szCs w:val="20"/>
+              </w:rPr>
+              <w:t>Multi-Agent</w:t>
+            </w:r>
+            <w:proofErr w:type="gramEnd"/>
+            <w:r>
+              <w:rPr>
+                <w:sz w:val="20"/>
+                <w:szCs w:val="20"/>
+              </w:rPr>
+              <w:t xml:space="preserve"> (20/10)</w:t>
             </w:r>
           </w:p>
         </w:tc>
@@ -3691,12 +4141,26 @@
           <w:p>
             <w:r>
               <w:rPr>
-                <w:b/>
-                <w:bCs/>
-                <w:sz w:val="20"/>
-                <w:szCs w:val="20"/>
-              </w:rPr>
-              <w:t>Hybrid Multi-Agent (30/10)</w:t>
+                <w:sz w:val="20"/>
+                <w:szCs w:val="20"/>
+              </w:rPr>
+              <w:t xml:space="preserve">Hybrid </w:t>
+            </w:r>
+            <w:proofErr w:type="gramStart"/>
+            <w:r>
+              <w:rPr>
+                <w:sz w:val="20"/>
+                <w:szCs w:val="20"/>
+              </w:rPr>
+              <w:t>Multi-Agent</w:t>
+            </w:r>
+            <w:proofErr w:type="gramEnd"/>
+            <w:r>
+              <w:rPr>
+                <w:sz w:val="20"/>
+                <w:szCs w:val="20"/>
+              </w:rPr>
+              <w:t xml:space="preserve"> (30/10)</w:t>
             </w:r>
           </w:p>
         </w:tc>
@@ -3902,7 +4366,7 @@
     </w:p>
     <w:p>
       <w:pPr>
-        <w:spacing w:after="200"/>
+        <w:spacing w:before="60" w:after="120"/>
       </w:pPr>
     </w:p>
     <w:p>
@@ -3919,9 +4383,18 @@
     <w:p>
       <w:pPr>
         <w:spacing w:before="60" w:after="120"/>
-      </w:pPr>
-      <w:r>
-        <w:t>The evaluation results reveal three distinct patterns that cut across all seven configurations. Each pattern has direct implications for the design of future RAG pipelines in specialised, high-precision domains like legal question answering.</w:t>
+        <w:jc w:val="both"/>
+      </w:pPr>
+      <w:r>
+        <w:t xml:space="preserve">The evaluation results reveal three distinct patterns that cut across all seven configurations. Each pattern has direct implications for the design of future RAG pipelines in </w:t>
+      </w:r>
+      <w:proofErr w:type="spellStart"/>
+      <w:r>
+        <w:t>specialised</w:t>
+      </w:r>
+      <w:proofErr w:type="spellEnd"/>
+      <w:r>
+        <w:t>, high-precision domains like legal question answering.</w:t>
       </w:r>
     </w:p>
     <w:p>
@@ -3935,10 +4408,33 @@
     <w:p>
       <w:pPr>
         <w:spacing w:before="60" w:after="120"/>
-      </w:pPr>
-      <w:r>
-        <w:t>The most pronounced effect observed across the entire evaluation is the relationship between the number of documents fed to a sub-agent and that sub-agent's faithfulness score. Comparing Multi-Agent configurations at two different top_k settings reveals a faithfulness delta of 0.152 — the largest single hyperparameter effect in the study.</w:t>
-      </w:r>
+        <w:jc w:val="both"/>
+      </w:pPr>
+      <w:r>
+        <w:t xml:space="preserve">The most pronounced effect observed across the entire evaluation is the relationship between the number of documents fed to a sub-agent and that sub-agent's faithfulness score. Comparing </w:t>
+      </w:r>
+      <w:proofErr w:type="gramStart"/>
+      <w:r>
+        <w:t>Multi-Agent</w:t>
+      </w:r>
+      <w:proofErr w:type="gramEnd"/>
+      <w:r>
+        <w:t xml:space="preserve"> configurations at two different </w:t>
+      </w:r>
+      <w:proofErr w:type="spellStart"/>
+      <w:r>
+        <w:t>top_k</w:t>
+      </w:r>
+      <w:proofErr w:type="spellEnd"/>
+      <w:r>
+        <w:t xml:space="preserve"> settings reveals a faithfulness delta of 0.152 — the largest single hyperparameter effect in the study.</w:t>
+      </w:r>
+    </w:p>
+    <w:p>
+      <w:pPr>
+        <w:spacing w:before="60" w:after="120"/>
+        <w:jc w:val="both"/>
+      </w:pPr>
     </w:p>
     <w:tbl>
       <w:tblPr>
@@ -4104,7 +4600,27 @@
                 <w:sz w:val="20"/>
                 <w:szCs w:val="20"/>
               </w:rPr>
-              <w:t>Multi Agent (top_k=10, final=7)</w:t>
+              <w:t>Multi Agent (</w:t>
+            </w:r>
+            <w:proofErr w:type="spellStart"/>
+            <w:r>
+              <w:rPr>
+                <w:b/>
+                <w:bCs/>
+                <w:sz w:val="20"/>
+                <w:szCs w:val="20"/>
+              </w:rPr>
+              <w:t>top_k</w:t>
+            </w:r>
+            <w:proofErr w:type="spellEnd"/>
+            <w:r>
+              <w:rPr>
+                <w:b/>
+                <w:bCs/>
+                <w:sz w:val="20"/>
+                <w:szCs w:val="20"/>
+              </w:rPr>
+              <w:t>=10, final=7)</w:t>
             </w:r>
           </w:p>
         </w:tc>
@@ -4201,7 +4717,27 @@
                 <w:sz w:val="20"/>
                 <w:szCs w:val="20"/>
               </w:rPr>
-              <w:t>Multi Agent (top_k=30, final=10)</w:t>
+              <w:t>Multi Agent (</w:t>
+            </w:r>
+            <w:proofErr w:type="spellStart"/>
+            <w:r>
+              <w:rPr>
+                <w:b/>
+                <w:bCs/>
+                <w:sz w:val="20"/>
+                <w:szCs w:val="20"/>
+              </w:rPr>
+              <w:t>top_k</w:t>
+            </w:r>
+            <w:proofErr w:type="spellEnd"/>
+            <w:r>
+              <w:rPr>
+                <w:b/>
+                <w:bCs/>
+                <w:sz w:val="20"/>
+                <w:szCs w:val="20"/>
+              </w:rPr>
+              <w:t>=30, final=10)</w:t>
             </w:r>
           </w:p>
         </w:tc>
@@ -4370,23 +4906,66 @@
       </w:pPr>
     </w:p>
     <w:p>
+      <w:r>
+        <w:br w:type="page"/>
+      </w:r>
+    </w:p>
+    <w:p>
       <w:pPr>
         <w:spacing w:before="60" w:after="120"/>
-      </w:pPr>
-      <w:r>
-        <w:t xml:space="preserve">The mechanism is straightforward: when a sub-agent receives 30 documents, a significant fraction of them will be marginally relevant or topically adjacent but not directly responsive to the query. The LLM, attempting to synthesise a comprehensive answer, draws on these peripheral documents and produces claims that are not grounded in the genuinely relevant subset — lowering the faithfulness score. With only 7–10 documents, the context is dense with on-point evidence, and the model has little room to </w:t>
-      </w:r>
+        <w:jc w:val="both"/>
+      </w:pPr>
       <w:r>
         <w:lastRenderedPageBreak/>
-        <w:t>hallucinate. Answer relevancy, by contrast, is far less sensitive to this effect (delta of only 0.010), suggesting that relevancy is primarily governed by the quality of the final synthesis rather than the breadth of the input context.</w:t>
+        <w:t xml:space="preserve">The mechanism is straightforward: when a sub-agent receives 30 documents, a significant fraction of them will be marginally relevant or topically adjacent but not directly responsive to the query. </w:t>
+      </w:r>
+      <w:proofErr w:type="gramStart"/>
+      <w:r>
+        <w:t>The LLM</w:t>
+      </w:r>
+      <w:proofErr w:type="gramEnd"/>
+      <w:r>
+        <w:t xml:space="preserve">, attempting to </w:t>
+      </w:r>
+      <w:r>
+        <w:t>synthesize</w:t>
+      </w:r>
+      <w:r>
+        <w:t xml:space="preserve"> a comprehensive answer, draws on these peripheral documents and produces claims that are not grounded in the genuinely relevant subset — lowering the faithfulness score. With only 7–10 documents, the context is dense with on-point evidence, and the model has little room to hallucinate. </w:t>
       </w:r>
     </w:p>
     <w:p>
       <w:pPr>
         <w:spacing w:before="60" w:after="120"/>
-      </w:pPr>
-      <w:r>
-        <w:t>This finding has a practical implication: for multi-agent architectures operating on legal corpora, the optimal top_k is not the largest feasible value but rather the smallest value that still achieves adequate recall. The Hybrid Multi-Agent results confirm this — faithfulness and relevancy both degrade monotonically as top_k increases from 15 to 20 to 30, while recall only marginally improves.</w:t>
+        <w:jc w:val="both"/>
+      </w:pPr>
+      <w:r>
+        <w:t>Answer relevancy, by contrast, is far less sensitive to this effect (delta of only 0.010), suggesting that relevancy is primarily governed by the quality of the final synthesis rather than the breadth of the input context.</w:t>
+      </w:r>
+    </w:p>
+    <w:p>
+      <w:pPr>
+        <w:spacing w:before="60" w:after="120"/>
+        <w:jc w:val="both"/>
+      </w:pPr>
+      <w:r>
+        <w:t xml:space="preserve">This finding has a practical implication: for multi-agent architectures operating on legal corpora, the optimal </w:t>
+      </w:r>
+      <w:proofErr w:type="spellStart"/>
+      <w:r>
+        <w:t>top_k</w:t>
+      </w:r>
+      <w:proofErr w:type="spellEnd"/>
+      <w:r>
+        <w:t xml:space="preserve"> is not the largest feasible value but rather the smallest value that still achieves adequate recall. The Hybrid Multi-Agent results confirm this — faithfulness and relevancy both degrade monotonically as </w:t>
+      </w:r>
+      <w:proofErr w:type="spellStart"/>
+      <w:r>
+        <w:t>top_k</w:t>
+      </w:r>
+      <w:proofErr w:type="spellEnd"/>
+      <w:r>
+        <w:t xml:space="preserve"> increases from 15 to 20 to 30, while recall only marginally improves.</w:t>
       </w:r>
     </w:p>
     <w:p>
@@ -4400,6 +4979,7 @@
     <w:p>
       <w:pPr>
         <w:spacing w:before="60" w:after="120"/>
+        <w:jc w:val="both"/>
       </w:pPr>
       <w:r>
         <w:t>The Hybrid RAG configuration (30/10) achieves the highest retrieval scores of all architectures — context precision of 1.000 means every single retrieved document was genuinely relevant, and context recall of 0.867 means nearly 87% of all relevant documents in the corpus were successfully retrieved. By standard information retrieval criteria, this is an excellent pipeline. Yet Hybrid RAG also produces the lowest answer relevancy score of the entire evaluation (0.486).</w:t>
@@ -4408,17 +4988,59 @@
     <w:p>
       <w:pPr>
         <w:spacing w:before="60" w:after="120"/>
-      </w:pPr>
-      <w:r>
-        <w:t>This apparent paradox is explained by the generation bottleneck: perfect retrieval is irrelevant if the generation step cannot process the retrieved evidence effectively. A single LLM call receiving 30 documents — even 30 perfectly relevant ones — faces a context aggregation problem. Legal documents from different jurisdictions, different procedural stages, and different articles of code may all be relevant in isolation but difficult to synthesise into a single coherent, focused answer. The model hedges, qualifies, and spans multiple sub-topics rather than identifying the single most responsive answer.</w:t>
+        <w:jc w:val="both"/>
+      </w:pPr>
+      <w:r>
+        <w:t xml:space="preserve">This apparent paradox is explained by the generation bottleneck: perfect retrieval is irrelevant if the generation step cannot process the retrieved evidence effectively. A single LLM call receiving 30 documents — even 30 perfectly relevant ones — faces a </w:t>
+      </w:r>
+      <w:r>
+        <w:rPr>
+          <w:b/>
+          <w:bCs/>
+        </w:rPr>
+        <w:t>context</w:t>
+      </w:r>
+      <w:r>
+        <w:t xml:space="preserve"> </w:t>
+      </w:r>
+      <w:r>
+        <w:rPr>
+          <w:b/>
+          <w:bCs/>
+        </w:rPr>
+        <w:t>aggregation problem</w:t>
+      </w:r>
+      <w:r>
+        <w:t xml:space="preserve">. Legal documents from different jurisdictions, different procedural stages, and different articles of code may all be relevant in isolation but difficult to </w:t>
+      </w:r>
+      <w:r>
+        <w:t>synthesize</w:t>
+      </w:r>
+      <w:r>
+        <w:t xml:space="preserve"> into a single coherent, focused answer. The model hedges, qualifies, and spans multiple sub-topics rather than identifying the single most responsive answer.</w:t>
       </w:r>
     </w:p>
     <w:p>
       <w:pPr>
         <w:spacing w:before="60" w:after="120"/>
-      </w:pPr>
-      <w:r>
-        <w:t>The Hybrid Multi-Agent architecture uses an identical retrieval pipeline — the same metadata extraction, two-phase FAISS, BM25+RRF, and cross-encoder steps — but routes the retrieved pool to sub-agents rather than a single LLM. Answer relevancy recovers from 0.486 to 0.826. This demonstrates conclusively that improving retrieval precision beyond a certain threshold yields diminishing returns unless the generation architecture is capable of consuming the evidence at the appropriate level of granularity.</w:t>
+        <w:jc w:val="both"/>
+      </w:pPr>
+      <w:r>
+        <w:t xml:space="preserve">The Hybrid Multi-Agent architecture uses an identical retrieval pipeline — the same metadata extraction, two-phase FAISS, BM25+RRF, and cross-encoder steps — but routes the retrieved pool to sub-agents rather than a single LLM. Answer relevancy recovers from 0.486 to 0.826. This demonstrates conclusively that improving retrieval precision beyond a </w:t>
+      </w:r>
+      <w:r>
+        <w:t>certain threshold yield</w:t>
+      </w:r>
+      <w:r>
+        <w:t xml:space="preserve"> diminishing returns unless the generation architecture </w:t>
+      </w:r>
+      <w:proofErr w:type="gramStart"/>
+      <w:r>
+        <w:t>is capable of consuming</w:t>
+      </w:r>
+      <w:proofErr w:type="gramEnd"/>
+      <w:r>
+        <w:t xml:space="preserve"> the evidence at the appropriate level of granularity.</w:t>
       </w:r>
     </w:p>
     <w:p>
@@ -4432,17 +5054,59 @@
     <w:p>
       <w:pPr>
         <w:spacing w:before="60" w:after="120"/>
-      </w:pPr>
-      <w:r>
-        <w:t>Answer correctness — the metric capturing factual overlap with ground-truth reference answers — shows the narrowest spread of all five metrics, ranging from 0.608 (Hybrid, 30/10) to 0.695 (Single Agent, 30/10), a range of just 0.087 points. Strikingly, the simplest architecture achieves the highest correctness score. This counterintuitive result arises because the Single Agent passes all retrieved evidence directly to the LLM without any intermediate summarisation step where details might be lost. Each additional layer of synthesis — sub-agent partial answers, supervisor consolidation — introduces a small probability of dropping or paraphrasing specific factual details present in the source documents.</w:t>
+        <w:jc w:val="both"/>
+      </w:pPr>
+      <w:r>
+        <w:t xml:space="preserve">Answer correctness — the metric capturing factual overlap with ground-truth reference answers — shows the narrowest spread of all five metrics, ranging from 0.608 (Hybrid, 30/10) to 0.695 (Single Agent, 30/10), a range of just 0.087 points. </w:t>
       </w:r>
     </w:p>
     <w:p>
       <w:pPr>
         <w:spacing w:before="60" w:after="120"/>
-      </w:pPr>
-      <w:r>
-        <w:t>More fundamentally, answer correctness measures alignment with a ground-truth reference answer, which is itself a fixed text. The LLM's capacity to reproduce the specific phrasing, citations, and factual claims in that reference is bounded by its parametric knowledge and its max_tokens budget. Increasing max_tokens from 384 to 768 in the current configuration reduces truncation artefacts for long answers, but the ceiling on correctness is set by the model itself rather than by the retrieval or synthesis strategy. Meaningful further gains on this metric would require a larger or more legally specialised foundation model, or higher-quality (longer, more specific) ground-truth reference answers.</w:t>
+        <w:jc w:val="both"/>
+      </w:pPr>
+      <w:r>
+        <w:t xml:space="preserve">Strikingly, the simplest architecture achieves the highest correctness score. This counterintuitive result arises because the Single Agent passes all retrieved evidence directly to the LLM without any intermediate </w:t>
+      </w:r>
+      <w:r>
+        <w:t>summarization</w:t>
+      </w:r>
+      <w:r>
+        <w:t xml:space="preserve"> step where details might be lost. Each additional layer of synthesis — sub-agent partial answers, supervisor consolidation — introduces a small probability of dropping or paraphrasing specific factual details present in the source documents.</w:t>
+      </w:r>
+    </w:p>
+    <w:p>
+      <w:pPr>
+        <w:spacing w:before="60" w:after="120"/>
+        <w:jc w:val="both"/>
+      </w:pPr>
+      <w:r>
+        <w:t xml:space="preserve">More fundamentally, answer correctness measures alignment with a ground-truth reference answer, which is itself a fixed text. The LLM's capacity to reproduce the specific phrasing, citations, and factual claims in that reference is bounded by its parametric knowledge and its </w:t>
+      </w:r>
+      <w:proofErr w:type="spellStart"/>
+      <w:r>
+        <w:t>max_tokens</w:t>
+      </w:r>
+      <w:proofErr w:type="spellEnd"/>
+      <w:r>
+        <w:t xml:space="preserve"> budget. Increasing </w:t>
+      </w:r>
+      <w:proofErr w:type="spellStart"/>
+      <w:r>
+        <w:lastRenderedPageBreak/>
+        <w:t>max_tokens</w:t>
+      </w:r>
+      <w:proofErr w:type="spellEnd"/>
+      <w:r>
+        <w:t xml:space="preserve"> from 384 to 768 in the current configuration reduces truncation artefacts for long answers, but the ceiling on correctness is set by the model itself rather than by the retrieval or synthesis strategy. Meaningful further gains on this metric would require a larger or more legally </w:t>
+      </w:r>
+      <w:proofErr w:type="spellStart"/>
+      <w:r>
+        <w:t>specialised</w:t>
+      </w:r>
+      <w:proofErr w:type="spellEnd"/>
+      <w:r>
+        <w:t xml:space="preserve"> foundation model, or higher-quality (longer, more specific) ground-truth reference answers.</w:t>
       </w:r>
     </w:p>
     <w:p>
@@ -4453,16 +5117,88 @@
         </w:pBdr>
       </w:pPr>
       <w:r>
-        <w:lastRenderedPageBreak/>
         <w:t>6. Conclusions</w:t>
       </w:r>
     </w:p>
     <w:p>
       <w:pPr>
         <w:spacing w:before="60" w:after="120"/>
-      </w:pPr>
-      <w:r>
-        <w:t>The evaluation demonstrates that the Hybrid Multi-Agent architecture at top_k=15, top_k_final=10 is the highest-performing configuration across the RAGAS framework, achieving a mean score of 0.784 and the distinction of being the only architecture to surpass the 0.80 threshold simultaneously on three metrics: faithfulness (0.812), answer relevancy (0.826), and context recall (0.800). Its performance is the result of combining two complementary design choices — a hybrid retrieval pipeline that maximises the quality and completeness of the retrieved evidence pool, and a multi-agent synthesis strategy that distributes that evidence across focused, isolated sub-agents rather than overwhelming a single LLM context window.</w:t>
+        <w:jc w:val="both"/>
+      </w:pPr>
+      <w:r>
+        <w:t xml:space="preserve">The evaluation demonstrates that the Hybrid Multi-Agent architecture at </w:t>
+      </w:r>
+      <w:proofErr w:type="spellStart"/>
+      <w:r>
+        <w:t>top_k</w:t>
+      </w:r>
+      <w:proofErr w:type="spellEnd"/>
+      <w:r>
+        <w:t xml:space="preserve">=15, </w:t>
+      </w:r>
+      <w:proofErr w:type="spellStart"/>
+      <w:r>
+        <w:t>top_k_final</w:t>
+      </w:r>
+      <w:proofErr w:type="spellEnd"/>
+      <w:r>
+        <w:t xml:space="preserve">=10 is the highest-performing configuration across the RAGAS framework, achieving a mean score of </w:t>
+      </w:r>
+      <w:r>
+        <w:rPr>
+          <w:b/>
+          <w:bCs/>
+        </w:rPr>
+        <w:t>0.</w:t>
+      </w:r>
+      <w:r>
+        <w:rPr>
+          <w:b/>
+          <w:bCs/>
+        </w:rPr>
+        <w:t>754</w:t>
+      </w:r>
+      <w:r>
+        <w:t xml:space="preserve">. Its performance is the result of combining two complementary design </w:t>
+      </w:r>
+      <w:proofErr w:type="gramStart"/>
+      <w:r>
+        <w:t xml:space="preserve">choices </w:t>
+      </w:r>
+      <w:r>
+        <w:t>:</w:t>
+      </w:r>
+      <w:proofErr w:type="gramEnd"/>
+    </w:p>
+    <w:p>
+      <w:pPr>
+        <w:spacing w:before="60" w:after="120"/>
+        <w:jc w:val="both"/>
+      </w:pPr>
+      <w:r>
+        <w:t xml:space="preserve">— a hybrid retrieval pipeline that </w:t>
+      </w:r>
+      <w:proofErr w:type="spellStart"/>
+      <w:r>
+        <w:t>maximises</w:t>
+      </w:r>
+      <w:proofErr w:type="spellEnd"/>
+      <w:r>
+        <w:t xml:space="preserve"> the quality and completeness of the retrieved evidence </w:t>
+      </w:r>
+      <w:proofErr w:type="gramStart"/>
+      <w:r>
+        <w:t xml:space="preserve">pool, </w:t>
+      </w:r>
+      <w:r>
+        <w:t>—</w:t>
+      </w:r>
+      <w:proofErr w:type="gramEnd"/>
+      <w:r>
+        <w:t xml:space="preserve"> </w:t>
+      </w:r>
+      <w:r>
+        <w:t>a multi-agent synthesis strategy that distributes that evidence across focused, isolated sub-agents rather than overwhelming a single LLM context window.</w:t>
       </w:r>
     </w:p>
     <w:p>
@@ -4483,7 +5219,15 @@
         <w:spacing w:before="40" w:after="40"/>
       </w:pPr>
       <w:r>
-        <w:t>Compact sub-agent context (10–15 documents) consistently outperforms large context (30 documents) for both faithfulness and relevancy; the optimal top_k is the smallest value that achieves adequate recall, not the largest feasible value</w:t>
+        <w:t xml:space="preserve">Compact sub-agent context (10–15 documents) consistently outperforms large context (30 documents) for both faithfulness and relevancy; the optimal </w:t>
+      </w:r>
+      <w:proofErr w:type="spellStart"/>
+      <w:r>
+        <w:t>top_k</w:t>
+      </w:r>
+      <w:proofErr w:type="spellEnd"/>
+      <w:r>
+        <w:t xml:space="preserve"> is the smallest value that achieves adequate recall, not the largest feasible value</w:t>
       </w:r>
     </w:p>
     <w:p>
@@ -4546,13 +5290,51 @@
     <w:p>
       <w:pPr>
         <w:spacing w:before="60" w:after="120"/>
-      </w:pPr>
-      <w:r>
         <w:rPr>
           <w:i/>
           <w:iCs/>
         </w:rPr>
-        <w:t>Recommended next step: Rebuild all four FAISS vector stores using BAAI/bge-base-en-v1.5 (768-dimensional embeddings) and re-run the full RAGAS evaluation. The higher-dimensional embedding space may capture more nuanced semantic relationships between legal concepts — particularly across jurisdictions where equivalent legal provisions use different terminology — and is expected to close the remaining gap in answer correctness that pipeline design changes alone cannot address.</w:t>
+      </w:pPr>
+      <w:r>
+        <w:rPr>
+          <w:i/>
+          <w:iCs/>
+        </w:rPr>
+        <w:t xml:space="preserve">Recommended next step: </w:t>
+      </w:r>
+    </w:p>
+    <w:p>
+      <w:pPr>
+        <w:pStyle w:val="ListParagraph"/>
+        <w:numPr>
+          <w:ilvl w:val="0"/>
+          <w:numId w:val="3"/>
+        </w:numPr>
+        <w:spacing w:before="60" w:after="120"/>
+      </w:pPr>
+      <w:r>
+        <w:rPr>
+          <w:i/>
+          <w:iCs/>
+        </w:rPr>
+        <w:t xml:space="preserve">Rebuild all four FAISS vector stores using BAAI/bge-base-en-v1.5 (768-dimensional embeddings) and re-run the full RAGAS evaluation. </w:t>
+      </w:r>
+    </w:p>
+    <w:p>
+      <w:pPr>
+        <w:pStyle w:val="ListParagraph"/>
+        <w:numPr>
+          <w:ilvl w:val="0"/>
+          <w:numId w:val="3"/>
+        </w:numPr>
+        <w:spacing w:before="60" w:after="120"/>
+      </w:pPr>
+      <w:r>
+        <w:rPr>
+          <w:i/>
+          <w:iCs/>
+        </w:rPr>
+        <w:t>The higher-dimensional embedding space may capture more nuanced semantic relationships between legal concepts — particularly across jurisdictions where equivalent legal provisions use different terminology — and is expected to close the remaining gap in answer correctness that pipeline design changes alone cannot address.</w:t>
       </w:r>
     </w:p>
     <w:sectPr>
@@ -5500,7 +6282,6 @@
   <w:style w:type="character" w:default="1" w:styleId="DefaultParagraphFont">
     <w:name w:val="Default Paragraph Font"/>
     <w:uiPriority w:val="1"/>
-    <w:semiHidden/>
     <w:unhideWhenUsed/>
   </w:style>
   <w:style w:type="table" w:default="1" w:styleId="TableNormal">

</xml_diff>